<commit_message>
feat: implementar View Transitions API para navegacion fluida estilo app nativa
</commit_message>
<xml_diff>
--- a/guias/Guía Paso a Paso #11.docx
+++ b/guias/Guía Paso a Paso #11.docx
@@ -16,16 +16,11 @@
         </w:rPr>
         <w:t xml:space="preserve">Guía Pedagógica: Día 11 - Deferrable Views (Carga Diferida) </w:t>
       </w:r>
-      <w:r>
-        <w:rPr>
-          <w:rFonts w:ascii="Segoe UI Emoji" w:hAnsi="Segoe UI Emoji" w:cs="Segoe UI Emoji"/>
-          <w:b/>
-          <w:bCs/>
-        </w:rPr>
-        <w:t>⏳</w:t>
-      </w:r>
-    </w:p>
-    <w:p>
+    </w:p>
+    <w:p>
+      <w:pPr>
+        <w:jc w:val="both"/>
+      </w:pPr>
       <w:r>
         <w:t>Hoy aprenderemos sobre una de las características más potentes de Angular para mejorar el rendimiento: los </w:t>
       </w:r>
@@ -51,36 +46,25 @@
       </w:r>
     </w:p>
     <w:p>
-      <w:r>
-        <w:pict w14:anchorId="2E9D5B95">
-          <v:rect id="_x0000_i1025" style="width:0;height:.75pt" o:hralign="center" o:hrstd="t" o:hr="t" fillcolor="#a0a0a0" stroked="f"/>
-        </w:pict>
-      </w:r>
-    </w:p>
-    <w:p>
-      <w:pPr>
-        <w:rPr>
-          <w:b/>
-          <w:bCs/>
-        </w:rPr>
-      </w:pPr>
-      <w:r>
-        <w:rPr>
-          <w:rFonts w:ascii="Segoe UI Emoji" w:hAnsi="Segoe UI Emoji" w:cs="Segoe UI Emoji"/>
-          <w:b/>
-          <w:bCs/>
-        </w:rPr>
-        <w:t>🧠</w:t>
-      </w:r>
-      <w:r>
-        <w:rPr>
-          <w:b/>
-          <w:bCs/>
-        </w:rPr>
-        <w:t xml:space="preserve"> Contexto Pedagógico: ¿Por qué diferir la carga?</w:t>
-      </w:r>
-    </w:p>
-    <w:p>
+      <w:pPr>
+        <w:jc w:val="both"/>
+        <w:rPr>
+          <w:b/>
+          <w:bCs/>
+        </w:rPr>
+      </w:pPr>
+      <w:r>
+        <w:rPr>
+          <w:b/>
+          <w:bCs/>
+        </w:rPr>
+        <w:t>Contexto Pedagógico: ¿Por qué diferir la carga?</w:t>
+      </w:r>
+    </w:p>
+    <w:p>
+      <w:pPr>
+        <w:jc w:val="both"/>
+      </w:pPr>
       <w:r>
         <w:t>En la página de detalles de una película, podríamos tener información crítica (título, sinopsis) y otra secundaria (el tráiler, lista de actores secundarios, o comentarios).</w:t>
       </w:r>
@@ -91,6 +75,7 @@
           <w:ilvl w:val="0"/>
           <w:numId w:val="1"/>
         </w:numPr>
+        <w:jc w:val="both"/>
       </w:pPr>
       <w:r>
         <w:rPr>
@@ -119,6 +104,7 @@
           <w:ilvl w:val="0"/>
           <w:numId w:val="1"/>
         </w:numPr>
+        <w:jc w:val="both"/>
       </w:pPr>
       <w:r>
         <w:rPr>
@@ -142,43 +128,45 @@
       </w:r>
     </w:p>
     <w:p>
-      <w:r>
-        <w:pict w14:anchorId="65CF21FE">
-          <v:rect id="_x0000_i1026" style="width:0;height:.75pt" o:hralign="center" o:hrstd="t" o:hr="t" fillcolor="#a0a0a0" stroked="f"/>
-        </w:pict>
-      </w:r>
-    </w:p>
-    <w:p>
-      <w:pPr>
-        <w:rPr>
-          <w:b/>
-          <w:bCs/>
-        </w:rPr>
-      </w:pPr>
-      <w:r>
-        <w:rPr>
-          <w:rFonts w:ascii="Segoe UI Emoji" w:hAnsi="Segoe UI Emoji" w:cs="Segoe UI Emoji"/>
-          <w:b/>
-          <w:bCs/>
-        </w:rPr>
-        <w:t>📡</w:t>
-      </w:r>
-      <w:r>
-        <w:rPr>
-          <w:b/>
-          <w:bCs/>
-        </w:rPr>
-        <w:t xml:space="preserve"> Paso 1: Identificando los Bloques Pesados</w:t>
-      </w:r>
-    </w:p>
-    <w:p>
-      <w:r>
-        <w:t>Imaginemos que en nuestro componente de detalle (src/app/features/movie-detail/movie-detail.component.ts), tenemos un componente pesado para el tráiler o el elenco completo. Por ahora, asumamos que tenemos un componente hipotético &lt;app-movie-trailer&gt; o &lt;app-movie-cast&gt; que queremos diferir.</w:t>
-      </w:r>
-    </w:p>
-    <w:p>
-      <w:r>
-        <w:t>Abre src/app/features/movie-detail/movie-detail.component.html:</w:t>
+      <w:pPr>
+        <w:jc w:val="both"/>
+        <w:rPr>
+          <w:b/>
+          <w:bCs/>
+        </w:rPr>
+      </w:pPr>
+      <w:r>
+        <w:rPr>
+          <w:b/>
+          <w:bCs/>
+        </w:rPr>
+        <w:t>Paso 1: Identificando los Bloques Pesados</w:t>
+      </w:r>
+    </w:p>
+    <w:p>
+      <w:pPr>
+        <w:jc w:val="both"/>
+      </w:pPr>
+      <w:r>
+        <w:t>Antes de crear el componente de tráiler, necesitamos un método en nuestro servicio para obtener los videos de una película.</w:t>
+      </w:r>
+    </w:p>
+    <w:p>
+      <w:pPr>
+        <w:jc w:val="both"/>
+      </w:pPr>
+      <w:r>
+        <w:t>Abre </w:t>
+      </w:r>
+      <w:r>
+        <w:rPr>
+          <w:b/>
+          <w:bCs/>
+        </w:rPr>
+        <w:t>src/app/core/services/movie.service.ts</w:t>
+      </w:r>
+      <w:r>
+        <w:t> y añade este método al final de la clase:</w:t>
       </w:r>
     </w:p>
     <w:p>
@@ -186,12 +174,11 @@
         <w:rPr>
           <w:noProof/>
         </w:rPr>
-        <w:lastRenderedPageBreak/>
         <w:drawing>
-          <wp:inline distT="0" distB="0" distL="0" distR="0" wp14:anchorId="533E9E2A" wp14:editId="255E7884">
-            <wp:extent cx="5612130" cy="3895090"/>
+          <wp:inline distT="0" distB="0" distL="0" distR="0" wp14:anchorId="1D49493B" wp14:editId="598A9D3D">
+            <wp:extent cx="5612130" cy="2346960"/>
             <wp:effectExtent l="0" t="0" r="7620" b="0"/>
-            <wp:docPr id="1594413044" name="Imagen 1"/>
+            <wp:docPr id="158860961" name="Imagen 1"/>
             <wp:cNvGraphicFramePr>
               <a:graphicFrameLocks xmlns:a="http://schemas.openxmlformats.org/drawingml/2006/main" noChangeAspect="1"/>
             </wp:cNvGraphicFramePr>
@@ -199,7 +186,7 @@
               <a:graphicData uri="http://schemas.openxmlformats.org/drawingml/2006/picture">
                 <pic:pic xmlns:pic="http://schemas.openxmlformats.org/drawingml/2006/picture">
                   <pic:nvPicPr>
-                    <pic:cNvPr id="1594413044" name=""/>
+                    <pic:cNvPr id="158860961" name=""/>
                     <pic:cNvPicPr/>
                   </pic:nvPicPr>
                   <pic:blipFill>
@@ -211,7 +198,7 @@
                   <pic:spPr>
                     <a:xfrm>
                       <a:off x="0" y="0"/>
-                      <a:ext cx="5612130" cy="3895090"/>
+                      <a:ext cx="5612130" cy="2346960"/>
                     </a:xfrm>
                     <a:prstGeom prst="rect">
                       <a:avLst/>
@@ -231,147 +218,76 @@
           <w:bCs/>
         </w:rPr>
       </w:pPr>
-      <w:r>
-        <w:rPr>
-          <w:b/>
-          <w:bCs/>
-        </w:rPr>
-        <w:t>Paso 2: Entendiendo los Triggers (Desencadenadores)</w:t>
-      </w:r>
-    </w:p>
-    <w:p>
-      <w:r>
-        <w:t>El bloque @defer admite varias condiciones (triggers) para iniciar la descarga y el renderizado. Hemos usado on viewport, pero existen muchos otros:</w:t>
-      </w:r>
-    </w:p>
-    <w:p>
-      <w:pPr>
-        <w:numPr>
-          <w:ilvl w:val="0"/>
-          <w:numId w:val="2"/>
-        </w:numPr>
-      </w:pPr>
-      <w:r>
-        <w:rPr>
-          <w:b/>
-          <w:bCs/>
-        </w:rPr>
-        <w:t>on viewport</w:t>
-      </w:r>
-      <w:r>
-        <w:t>: Cuando el elemento entra en la pantalla (usa un </w:t>
+    </w:p>
+    <w:p>
+      <w:pPr>
+        <w:jc w:val="both"/>
+        <w:rPr>
+          <w:b/>
+          <w:bCs/>
+        </w:rPr>
+      </w:pPr>
+      <w:r>
+        <w:rPr>
+          <w:b/>
+          <w:bCs/>
+        </w:rPr>
+        <w:lastRenderedPageBreak/>
+        <w:t>Paso 2: Crear el Pipe de Seguridad (SafePipe)</w:t>
+      </w:r>
+    </w:p>
+    <w:p>
+      <w:pPr>
+        <w:jc w:val="both"/>
+      </w:pPr>
+      <w:r>
+        <w:t>Angular bloquea por seguridad las URLs dinámicas en iframes para prevenir ataques XSS. Necesitamos un </w:t>
       </w:r>
       <w:r>
         <w:rPr>
           <w:i/>
           <w:iCs/>
         </w:rPr>
-        <w:t>Intersection Observer</w:t>
-      </w:r>
-      <w:r>
-        <w:t> nativo por detrás).</w:t>
-      </w:r>
-    </w:p>
-    <w:p>
-      <w:pPr>
-        <w:numPr>
-          <w:ilvl w:val="0"/>
-          <w:numId w:val="2"/>
-        </w:numPr>
-      </w:pPr>
-      <w:r>
-        <w:rPr>
-          <w:b/>
-          <w:bCs/>
-        </w:rPr>
-        <w:t>on interaction</w:t>
-      </w:r>
-      <w:r>
-        <w:t>: Cuando el usuario interactúa (hace clic, toca) el área del placeholder.</w:t>
-      </w:r>
-    </w:p>
-    <w:p>
-      <w:pPr>
-        <w:numPr>
-          <w:ilvl w:val="0"/>
-          <w:numId w:val="2"/>
-        </w:numPr>
-      </w:pPr>
-      <w:r>
-        <w:rPr>
-          <w:b/>
-          <w:bCs/>
-        </w:rPr>
-        <w:t>on hover</w:t>
-      </w:r>
-      <w:r>
-        <w:t>: Cuando el cursor pasa por encima del área.</w:t>
-      </w:r>
-    </w:p>
-    <w:p>
-      <w:pPr>
-        <w:numPr>
-          <w:ilvl w:val="0"/>
-          <w:numId w:val="2"/>
-        </w:numPr>
-      </w:pPr>
-      <w:r>
-        <w:rPr>
-          <w:b/>
-          <w:bCs/>
-        </w:rPr>
-        <w:t>on timer(5s)</w:t>
-      </w:r>
-      <w:r>
-        <w:t>: Carga automática después de un tiempo definido (ej. 5 segundos).</w:t>
-      </w:r>
-    </w:p>
-    <w:p>
-      <w:pPr>
-        <w:numPr>
-          <w:ilvl w:val="0"/>
-          <w:numId w:val="2"/>
-        </w:numPr>
-      </w:pPr>
-      <w:r>
-        <w:rPr>
-          <w:b/>
-          <w:bCs/>
-        </w:rPr>
-        <w:t>when condicionBoolean</w:t>
-      </w:r>
-      <w:r>
-        <w:t>: Carga imperativa basada en una señal o variable booleana de tu TypeScript.</w:t>
-      </w:r>
-    </w:p>
-    <w:p>
-      <w:pPr>
-        <w:rPr>
-          <w:b/>
-          <w:bCs/>
-        </w:rPr>
-      </w:pPr>
-      <w:r>
-        <w:rPr>
-          <w:b/>
-          <w:bCs/>
-        </w:rPr>
-        <w:t>Ejemplo Combinado (Interacción o Hover)</w:t>
-      </w:r>
-    </w:p>
-    <w:p>
-      <w:r>
-        <w:t>Puedes combinar varios triggers. Por ejemplo, para cargar el elenco de actores:</w:t>
-      </w:r>
-    </w:p>
-    <w:p>
-      <w:r>
-        <w:lastRenderedPageBreak/>
+        <w:t>Pipe</w:t>
+      </w:r>
+      <w:r>
+        <w:t> que le diga a Angular: "confío en esta URL, déjala pasar".</w:t>
+      </w:r>
+    </w:p>
+    <w:p>
+      <w:pPr>
+        <w:jc w:val="both"/>
+        <w:rPr>
+          <w:b/>
+          <w:bCs/>
+        </w:rPr>
+      </w:pPr>
+      <w:r>
+        <w:t>Crea el archivo </w:t>
+      </w:r>
+      <w:r>
+        <w:rPr>
+          <w:b/>
+          <w:bCs/>
+        </w:rPr>
+        <w:t>src/app/shared/pipes/safe.pipe.ts:</w:t>
+      </w:r>
+    </w:p>
+    <w:p>
+      <w:pPr>
+        <w:jc w:val="both"/>
+      </w:pPr>
+    </w:p>
+    <w:p>
+      <w:r>
+        <w:rPr>
+          <w:noProof/>
+        </w:rPr>
         <w:drawing>
-          <wp:inline distT="0" distB="0" distL="0" distR="0" wp14:anchorId="5A5096A9" wp14:editId="69BBBC46">
-            <wp:extent cx="5612130" cy="1699895"/>
-            <wp:effectExtent l="0" t="0" r="7620" b="0"/>
-            <wp:docPr id="1625823232" name="Imagen 1" descr="Texto&#10;&#10;Descripción generada automáticamente"/>
+          <wp:inline distT="0" distB="0" distL="0" distR="0" wp14:anchorId="5A5096A9" wp14:editId="22C7B1A0">
+            <wp:extent cx="5822711" cy="3581400"/>
+            <wp:effectExtent l="0" t="0" r="6985" b="0"/>
+            <wp:docPr id="1625823232" name="Imagen 1"/>
             <wp:cNvGraphicFramePr>
               <a:graphicFrameLocks xmlns:a="http://schemas.openxmlformats.org/drawingml/2006/main" noChangeAspect="1"/>
             </wp:cNvGraphicFramePr>
@@ -379,11 +295,17 @@
               <a:graphicData uri="http://schemas.openxmlformats.org/drawingml/2006/picture">
                 <pic:pic xmlns:pic="http://schemas.openxmlformats.org/drawingml/2006/picture">
                   <pic:nvPicPr>
-                    <pic:cNvPr id="1625823232" name="Imagen 1" descr="Texto&#10;&#10;Descripción generada automáticamente"/>
+                    <pic:cNvPr id="1625823232" name="Imagen 1"/>
                     <pic:cNvPicPr/>
                   </pic:nvPicPr>
                   <pic:blipFill>
-                    <a:blip r:embed="rId6"/>
+                    <a:blip r:embed="rId6">
+                      <a:extLst>
+                        <a:ext uri="{28A0092B-C50C-407E-A947-70E740481C1C}">
+                          <a14:useLocalDpi xmlns:a14="http://schemas.microsoft.com/office/drawing/2010/main" val="0"/>
+                        </a:ext>
+                      </a:extLst>
+                    </a:blip>
                     <a:stretch>
                       <a:fillRect/>
                     </a:stretch>
@@ -391,7 +313,7 @@
                   <pic:spPr>
                     <a:xfrm>
                       <a:off x="0" y="0"/>
-                      <a:ext cx="5612130" cy="1699895"/>
+                      <a:ext cx="5852029" cy="3599433"/>
                     </a:xfrm>
                     <a:prstGeom prst="rect">
                       <a:avLst/>
@@ -411,36 +333,64 @@
           <w:bCs/>
         </w:rPr>
       </w:pPr>
-      <w:r>
-        <w:rPr>
-          <w:b/>
-          <w:bCs/>
-        </w:rPr>
-        <w:t>Paso 3: Optimizando los Bloques Secundarios (CSS)</w:t>
-      </w:r>
-    </w:p>
-    <w:p>
-      <w:r>
-        <w:t>Añadir placeholders visualmente estables mejora la UX y evita el salto de contenido (</w:t>
-      </w:r>
-      <w:r>
-        <w:rPr>
-          <w:i/>
-          <w:iCs/>
-        </w:rPr>
-        <w:t>Layout Shift</w:t>
-      </w:r>
-      <w:r>
-        <w:t>). Añade estos estilos en movie-detail.component.css:</w:t>
-      </w:r>
-    </w:p>
-    <w:p>
-      <w:r>
+    </w:p>
+    <w:p>
+      <w:pPr>
+        <w:jc w:val="both"/>
+        <w:rPr>
+          <w:b/>
+          <w:bCs/>
+        </w:rPr>
+      </w:pPr>
+      <w:r>
+        <w:rPr>
+          <w:b/>
+          <w:bCs/>
+        </w:rPr>
+        <w:t xml:space="preserve">Paso 3: </w:t>
+      </w:r>
+      <w:r>
+        <w:rPr>
+          <w:b/>
+          <w:bCs/>
+        </w:rPr>
+        <w:t>Crear el Componente MovieTrailer</w:t>
+      </w:r>
+    </w:p>
+    <w:p>
+      <w:pPr>
+        <w:jc w:val="both"/>
+      </w:pPr>
+      <w:r>
+        <w:t>Este es el componente "pesado" que queremos diferir. Carga un iframe de YouTube con el tráiler oficial.</w:t>
+      </w:r>
+    </w:p>
+    <w:p>
+      <w:pPr>
+        <w:jc w:val="both"/>
+      </w:pPr>
+      <w:r>
+        <w:t xml:space="preserve">Crea el </w:t>
+      </w:r>
+      <w:r>
+        <w:rPr>
+          <w:b/>
+          <w:bCs/>
+        </w:rPr>
+        <w:t>archivo src/app/features/movie-details/components/movie-trailer/movie-trailer.ts:</w:t>
+      </w:r>
+    </w:p>
+    <w:p>
+      <w:r>
+        <w:rPr>
+          <w:noProof/>
+        </w:rPr>
+        <w:lastRenderedPageBreak/>
         <w:drawing>
-          <wp:inline distT="0" distB="0" distL="0" distR="0" wp14:anchorId="118E144A" wp14:editId="4418D47F">
-            <wp:extent cx="5612130" cy="3836035"/>
-            <wp:effectExtent l="0" t="0" r="7620" b="0"/>
-            <wp:docPr id="1228553603" name="Imagen 1" descr="Texto&#10;&#10;Descripción generada automáticamente"/>
+          <wp:inline distT="0" distB="0" distL="0" distR="0" wp14:anchorId="65BFCA9C" wp14:editId="5B8B1034">
+            <wp:extent cx="5612130" cy="5841365"/>
+            <wp:effectExtent l="0" t="0" r="7620" b="6985"/>
+            <wp:docPr id="1847316185" name="Imagen 1"/>
             <wp:cNvGraphicFramePr>
               <a:graphicFrameLocks xmlns:a="http://schemas.openxmlformats.org/drawingml/2006/main" noChangeAspect="1"/>
             </wp:cNvGraphicFramePr>
@@ -448,7 +398,7 @@
               <a:graphicData uri="http://schemas.openxmlformats.org/drawingml/2006/picture">
                 <pic:pic xmlns:pic="http://schemas.openxmlformats.org/drawingml/2006/picture">
                   <pic:nvPicPr>
-                    <pic:cNvPr id="1228553603" name="Imagen 1" descr="Texto&#10;&#10;Descripción generada automáticamente"/>
+                    <pic:cNvPr id="1847316185" name=""/>
                     <pic:cNvPicPr/>
                   </pic:nvPicPr>
                   <pic:blipFill>
@@ -460,7 +410,7 @@
                   <pic:spPr>
                     <a:xfrm>
                       <a:off x="0" y="0"/>
-                      <a:ext cx="5612130" cy="3836035"/>
+                      <a:ext cx="5612130" cy="5841365"/>
                     </a:xfrm>
                     <a:prstGeom prst="rect">
                       <a:avLst/>
@@ -480,6 +430,500 @@
           <w:bCs/>
         </w:rPr>
       </w:pPr>
+    </w:p>
+    <w:p>
+      <w:pPr>
+        <w:rPr>
+          <w:b/>
+          <w:bCs/>
+        </w:rPr>
+      </w:pPr>
+    </w:p>
+    <w:p>
+      <w:pPr>
+        <w:rPr>
+          <w:b/>
+          <w:bCs/>
+        </w:rPr>
+      </w:pPr>
+    </w:p>
+    <w:p>
+      <w:pPr>
+        <w:rPr>
+          <w:b/>
+          <w:bCs/>
+        </w:rPr>
+      </w:pPr>
+    </w:p>
+    <w:p>
+      <w:pPr>
+        <w:rPr>
+          <w:b/>
+          <w:bCs/>
+        </w:rPr>
+      </w:pPr>
+      <w:r>
+        <w:rPr>
+          <w:b/>
+          <w:bCs/>
+        </w:rPr>
+        <w:t>3.2 Crear los estilos del Tráiler</w:t>
+      </w:r>
+    </w:p>
+    <w:p>
+      <w:pPr>
+        <w:rPr>
+          <w:b/>
+          <w:bCs/>
+        </w:rPr>
+      </w:pPr>
+      <w:r>
+        <w:t>Crea el archivo de estilos</w:t>
+      </w:r>
+      <w:r>
+        <w:rPr>
+          <w:b/>
+          <w:bCs/>
+        </w:rPr>
+        <w:t> src/app/features/movie-details/components/movie-trailer/movie-trailer.css:</w:t>
+      </w:r>
+    </w:p>
+    <w:p>
+      <w:pPr>
+        <w:rPr>
+          <w:b/>
+          <w:bCs/>
+        </w:rPr>
+      </w:pPr>
+      <w:r>
+        <w:rPr>
+          <w:b/>
+          <w:bCs/>
+          <w:noProof/>
+        </w:rPr>
+        <w:lastRenderedPageBreak/>
+        <w:drawing>
+          <wp:inline distT="0" distB="0" distL="0" distR="0" wp14:anchorId="1EBD8004" wp14:editId="706BD323">
+            <wp:extent cx="5612130" cy="5568315"/>
+            <wp:effectExtent l="0" t="0" r="7620" b="0"/>
+            <wp:docPr id="1210474926" name="Imagen 1" descr="Texto&#10;&#10;Descripción generada automáticamente"/>
+            <wp:cNvGraphicFramePr>
+              <a:graphicFrameLocks xmlns:a="http://schemas.openxmlformats.org/drawingml/2006/main" noChangeAspect="1"/>
+            </wp:cNvGraphicFramePr>
+            <a:graphic xmlns:a="http://schemas.openxmlformats.org/drawingml/2006/main">
+              <a:graphicData uri="http://schemas.openxmlformats.org/drawingml/2006/picture">
+                <pic:pic xmlns:pic="http://schemas.openxmlformats.org/drawingml/2006/picture">
+                  <pic:nvPicPr>
+                    <pic:cNvPr id="1210474926" name="Imagen 1" descr="Texto&#10;&#10;Descripción generada automáticamente"/>
+                    <pic:cNvPicPr/>
+                  </pic:nvPicPr>
+                  <pic:blipFill>
+                    <a:blip r:embed="rId8"/>
+                    <a:stretch>
+                      <a:fillRect/>
+                    </a:stretch>
+                  </pic:blipFill>
+                  <pic:spPr>
+                    <a:xfrm>
+                      <a:off x="0" y="0"/>
+                      <a:ext cx="5612130" cy="5568315"/>
+                    </a:xfrm>
+                    <a:prstGeom prst="rect">
+                      <a:avLst/>
+                    </a:prstGeom>
+                  </pic:spPr>
+                </pic:pic>
+              </a:graphicData>
+            </a:graphic>
+          </wp:inline>
+        </w:drawing>
+      </w:r>
+    </w:p>
+    <w:p>
+      <w:pPr>
+        <w:rPr>
+          <w:b/>
+          <w:bCs/>
+        </w:rPr>
+      </w:pPr>
+      <w:r>
+        <w:rPr>
+          <w:b/>
+          <w:bCs/>
+        </w:rPr>
+        <w:t>Paso 4: Aplicar @defer en la Vista de Detalles</w:t>
+      </w:r>
+    </w:p>
+    <w:p>
+      <w:pPr>
+        <w:jc w:val="both"/>
+      </w:pPr>
+      <w:r>
+        <w:t>Ahora viene lo más importante. Abrimos src/app/features/movie-details/movie-details.html y envolvemos las secciones secundarias con @defer.</w:t>
+      </w:r>
+    </w:p>
+    <w:p>
+      <w:pPr>
+        <w:jc w:val="both"/>
+        <w:rPr>
+          <w:b/>
+          <w:bCs/>
+        </w:rPr>
+      </w:pPr>
+      <w:r>
+        <w:rPr>
+          <w:b/>
+          <w:bCs/>
+        </w:rPr>
+        <w:t>4.1 Tráiler con @defer (on viewport)</w:t>
+      </w:r>
+    </w:p>
+    <w:p>
+      <w:pPr>
+        <w:jc w:val="both"/>
+      </w:pPr>
+      <w:r>
+        <w:t>Añadimos una nueva sección de tráiler justo después de la sinopsis. El tráiler (y todo su JavaScript + iframe de YouTube) solo se descargará cuando el usuario haga scroll hasta esa zona.</w:t>
+      </w:r>
+    </w:p>
+    <w:p>
+      <w:pPr>
+        <w:jc w:val="both"/>
+      </w:pPr>
+    </w:p>
+    <w:p>
+      <w:pPr>
+        <w:jc w:val="both"/>
+      </w:pPr>
+    </w:p>
+    <w:p>
+      <w:pPr>
+        <w:jc w:val="both"/>
+        <w:rPr>
+          <w:b/>
+          <w:bCs/>
+        </w:rPr>
+      </w:pPr>
+      <w:r>
+        <w:rPr>
+          <w:b/>
+          <w:bCs/>
+        </w:rPr>
+        <w:lastRenderedPageBreak/>
+        <w:t>4.2 Elenco con @defer (on viewport)</w:t>
+      </w:r>
+    </w:p>
+    <w:p>
+      <w:pPr>
+        <w:jc w:val="both"/>
+      </w:pPr>
+      <w:r>
+        <w:t>El elenco de actores ya existe en nuestro HTML. Lo envolvemos con @defer para que también se cargue de forma diferida.</w:t>
+      </w:r>
+    </w:p>
+    <w:p>
+      <w:pPr>
+        <w:jc w:val="both"/>
+      </w:pPr>
+      <w:r>
+        <w:t>El HTML completo queda así (solo se muestran las secciones modificadas dentro del bloque @if):</w:t>
+      </w:r>
+    </w:p>
+    <w:p>
+      <w:pPr>
+        <w:rPr>
+          <w:b/>
+          <w:bCs/>
+        </w:rPr>
+      </w:pPr>
+      <w:r>
+        <w:rPr>
+          <w:b/>
+          <w:bCs/>
+          <w:noProof/>
+        </w:rPr>
+        <w:drawing>
+          <wp:inline distT="0" distB="0" distL="0" distR="0" wp14:anchorId="1F3F760D" wp14:editId="2C55D587">
+            <wp:extent cx="5612130" cy="6565265"/>
+            <wp:effectExtent l="0" t="0" r="7620" b="6985"/>
+            <wp:docPr id="705314629" name="Imagen 1"/>
+            <wp:cNvGraphicFramePr>
+              <a:graphicFrameLocks xmlns:a="http://schemas.openxmlformats.org/drawingml/2006/main" noChangeAspect="1"/>
+            </wp:cNvGraphicFramePr>
+            <a:graphic xmlns:a="http://schemas.openxmlformats.org/drawingml/2006/main">
+              <a:graphicData uri="http://schemas.openxmlformats.org/drawingml/2006/picture">
+                <pic:pic xmlns:pic="http://schemas.openxmlformats.org/drawingml/2006/picture">
+                  <pic:nvPicPr>
+                    <pic:cNvPr id="705314629" name=""/>
+                    <pic:cNvPicPr/>
+                  </pic:nvPicPr>
+                  <pic:blipFill>
+                    <a:blip r:embed="rId9"/>
+                    <a:stretch>
+                      <a:fillRect/>
+                    </a:stretch>
+                  </pic:blipFill>
+                  <pic:spPr>
+                    <a:xfrm>
+                      <a:off x="0" y="0"/>
+                      <a:ext cx="5612130" cy="6565265"/>
+                    </a:xfrm>
+                    <a:prstGeom prst="rect">
+                      <a:avLst/>
+                    </a:prstGeom>
+                  </pic:spPr>
+                </pic:pic>
+              </a:graphicData>
+            </a:graphic>
+          </wp:inline>
+        </w:drawing>
+      </w:r>
+    </w:p>
+    <w:p>
+      <w:pPr>
+        <w:rPr>
+          <w:b/>
+          <w:bCs/>
+        </w:rPr>
+      </w:pPr>
+      <w:r>
+        <w:rPr>
+          <w:b/>
+          <w:bCs/>
+        </w:rPr>
+        <w:lastRenderedPageBreak/>
+        <w:t>Paso 5: Entendiendo los Triggers (Desencadenadores)</w:t>
+      </w:r>
+    </w:p>
+    <w:p>
+      <w:r>
+        <w:t>El bloque @defer admite varias condiciones (triggers) para iniciar la descarga:</w:t>
+      </w:r>
+    </w:p>
+    <w:p>
+      <w:pPr>
+        <w:numPr>
+          <w:ilvl w:val="0"/>
+          <w:numId w:val="4"/>
+        </w:numPr>
+      </w:pPr>
+      <w:r>
+        <w:t>on viewport: Cuando el elemento entra en la pantalla (usa un </w:t>
+      </w:r>
+      <w:r>
+        <w:rPr>
+          <w:i/>
+          <w:iCs/>
+        </w:rPr>
+        <w:t>Intersection Observer</w:t>
+      </w:r>
+      <w:r>
+        <w:t> nativo por detrás). Es el que usamos aquí.</w:t>
+      </w:r>
+    </w:p>
+    <w:p>
+      <w:pPr>
+        <w:numPr>
+          <w:ilvl w:val="0"/>
+          <w:numId w:val="4"/>
+        </w:numPr>
+      </w:pPr>
+      <w:r>
+        <w:t>on interaction: Cuando el usuario hace clic o toca el área del placeholder.</w:t>
+      </w:r>
+    </w:p>
+    <w:p>
+      <w:pPr>
+        <w:numPr>
+          <w:ilvl w:val="0"/>
+          <w:numId w:val="4"/>
+        </w:numPr>
+      </w:pPr>
+      <w:r>
+        <w:t>on hover: Cuando el cursor pasa por encima del área.</w:t>
+      </w:r>
+    </w:p>
+    <w:p>
+      <w:pPr>
+        <w:numPr>
+          <w:ilvl w:val="0"/>
+          <w:numId w:val="4"/>
+        </w:numPr>
+      </w:pPr>
+      <w:r>
+        <w:t>on timer(5s): Carga automática después de un tiempo definido (ej. 5 segundos).</w:t>
+      </w:r>
+    </w:p>
+    <w:p>
+      <w:pPr>
+        <w:numPr>
+          <w:ilvl w:val="0"/>
+          <w:numId w:val="4"/>
+        </w:numPr>
+      </w:pPr>
+      <w:r>
+        <w:t>when condicionBoolean: Carga imperativa basada en una señal o variable booleana.</w:t>
+      </w:r>
+    </w:p>
+    <w:p>
+      <w:pPr>
+        <w:rPr>
+          <w:b/>
+          <w:bCs/>
+        </w:rPr>
+      </w:pPr>
+      <w:r>
+        <w:t>Se pueden combinar: @defer (on interaction; on hover) carga cuando el usuario hace clic o pasa el ratón por encima</w:t>
+      </w:r>
+      <w:r>
+        <w:rPr>
+          <w:b/>
+          <w:bCs/>
+        </w:rPr>
+        <w:t>.</w:t>
+      </w:r>
+    </w:p>
+    <w:p>
+      <w:pPr>
+        <w:rPr>
+          <w:b/>
+          <w:bCs/>
+        </w:rPr>
+      </w:pPr>
+      <w:r>
+        <w:rPr>
+          <w:b/>
+          <w:bCs/>
+        </w:rPr>
+        <w:t>Paso 6: Estilos para los Placeholders (CSS)</w:t>
+      </w:r>
+    </w:p>
+    <w:p>
+      <w:pPr>
+        <w:rPr>
+          <w:b/>
+          <w:bCs/>
+        </w:rPr>
+      </w:pPr>
+      <w:r>
+        <w:t>Añade estos estilos al final de</w:t>
+      </w:r>
+      <w:r>
+        <w:rPr>
+          <w:b/>
+          <w:bCs/>
+        </w:rPr>
+        <w:t> src/app/features/movie-details/movie-details.css:</w:t>
+      </w:r>
+    </w:p>
+    <w:p>
+      <w:pPr>
+        <w:rPr>
+          <w:b/>
+          <w:bCs/>
+        </w:rPr>
+      </w:pPr>
+      <w:r>
+        <w:rPr>
+          <w:b/>
+          <w:bCs/>
+          <w:noProof/>
+        </w:rPr>
+        <w:lastRenderedPageBreak/>
+        <w:drawing>
+          <wp:inline distT="0" distB="0" distL="0" distR="0" wp14:anchorId="402DD5A9" wp14:editId="467AF581">
+            <wp:extent cx="4761230" cy="8258810"/>
+            <wp:effectExtent l="0" t="0" r="1270" b="8890"/>
+            <wp:docPr id="805954856" name="Imagen 1" descr="Texto&#10;&#10;Descripción generada automáticamente"/>
+            <wp:cNvGraphicFramePr>
+              <a:graphicFrameLocks xmlns:a="http://schemas.openxmlformats.org/drawingml/2006/main" noChangeAspect="1"/>
+            </wp:cNvGraphicFramePr>
+            <a:graphic xmlns:a="http://schemas.openxmlformats.org/drawingml/2006/main">
+              <a:graphicData uri="http://schemas.openxmlformats.org/drawingml/2006/picture">
+                <pic:pic xmlns:pic="http://schemas.openxmlformats.org/drawingml/2006/picture">
+                  <pic:nvPicPr>
+                    <pic:cNvPr id="805954856" name="Imagen 1" descr="Texto&#10;&#10;Descripción generada automáticamente"/>
+                    <pic:cNvPicPr/>
+                  </pic:nvPicPr>
+                  <pic:blipFill>
+                    <a:blip r:embed="rId10"/>
+                    <a:stretch>
+                      <a:fillRect/>
+                    </a:stretch>
+                  </pic:blipFill>
+                  <pic:spPr>
+                    <a:xfrm>
+                      <a:off x="0" y="0"/>
+                      <a:ext cx="4761230" cy="8258810"/>
+                    </a:xfrm>
+                    <a:prstGeom prst="rect">
+                      <a:avLst/>
+                    </a:prstGeom>
+                  </pic:spPr>
+                </pic:pic>
+              </a:graphicData>
+            </a:graphic>
+          </wp:inline>
+        </w:drawing>
+      </w:r>
+    </w:p>
+    <w:p>
+      <w:pPr>
+        <w:rPr>
+          <w:b/>
+          <w:bCs/>
+        </w:rPr>
+      </w:pPr>
+      <w:r>
+        <w:rPr>
+          <w:b/>
+          <w:bCs/>
+        </w:rPr>
+        <w:lastRenderedPageBreak/>
+        <w:drawing>
+          <wp:inline distT="0" distB="0" distL="0" distR="0" wp14:anchorId="059CB657" wp14:editId="60D00D37">
+            <wp:extent cx="5612130" cy="3282315"/>
+            <wp:effectExtent l="0" t="0" r="7620" b="0"/>
+            <wp:docPr id="1671923875" name="Imagen 1"/>
+            <wp:cNvGraphicFramePr>
+              <a:graphicFrameLocks xmlns:a="http://schemas.openxmlformats.org/drawingml/2006/main" noChangeAspect="1"/>
+            </wp:cNvGraphicFramePr>
+            <a:graphic xmlns:a="http://schemas.openxmlformats.org/drawingml/2006/main">
+              <a:graphicData uri="http://schemas.openxmlformats.org/drawingml/2006/picture">
+                <pic:pic xmlns:pic="http://schemas.openxmlformats.org/drawingml/2006/picture">
+                  <pic:nvPicPr>
+                    <pic:cNvPr id="1671923875" name=""/>
+                    <pic:cNvPicPr/>
+                  </pic:nvPicPr>
+                  <pic:blipFill>
+                    <a:blip r:embed="rId11"/>
+                    <a:stretch>
+                      <a:fillRect/>
+                    </a:stretch>
+                  </pic:blipFill>
+                  <pic:spPr>
+                    <a:xfrm>
+                      <a:off x="0" y="0"/>
+                      <a:ext cx="5612130" cy="3282315"/>
+                    </a:xfrm>
+                    <a:prstGeom prst="rect">
+                      <a:avLst/>
+                    </a:prstGeom>
+                  </pic:spPr>
+                </pic:pic>
+              </a:graphicData>
+            </a:graphic>
+          </wp:inline>
+        </w:drawing>
+      </w:r>
+    </w:p>
+    <w:p>
+      <w:pPr>
+        <w:rPr>
+          <w:b/>
+          <w:bCs/>
+        </w:rPr>
+      </w:pPr>
       <w:r>
         <w:rPr>
           <w:b/>
@@ -525,7 +969,6 @@
           <w:b/>
           <w:bCs/>
         </w:rPr>
-        <w:lastRenderedPageBreak/>
         <w:t>¿Para qué sirve el bloque @placeholder?</w:t>
       </w:r>
       <w:r>
@@ -565,42 +1008,28 @@
       </w:r>
     </w:p>
     <w:p>
-      <w:r>
-        <w:pict w14:anchorId="29E758CD">
-          <v:rect id="_x0000_i1033" style="width:0;height:.75pt" o:hralign="center" o:hrstd="t" o:hr="t" fillcolor="#a0a0a0" stroked="f"/>
-        </w:pict>
-      </w:r>
-    </w:p>
-    <w:p>
-      <w:pPr>
-        <w:rPr>
-          <w:b/>
-          <w:bCs/>
-        </w:rPr>
-      </w:pPr>
-      <w:r>
-        <w:rPr>
-          <w:rFonts w:ascii="Segoe UI Emoji" w:hAnsi="Segoe UI Emoji" w:cs="Segoe UI Emoji"/>
-          <w:b/>
-          <w:bCs/>
-        </w:rPr>
-        <w:t>💾</w:t>
-      </w:r>
-      <w:r>
-        <w:rPr>
-          <w:b/>
-          <w:bCs/>
-        </w:rPr>
-        <w:t xml:space="preserve"> Control de Versiones</w:t>
+      <w:pPr>
+        <w:rPr>
+          <w:b/>
+          <w:bCs/>
+        </w:rPr>
+      </w:pPr>
+      <w:r>
+        <w:rPr>
+          <w:b/>
+          <w:bCs/>
+        </w:rPr>
+        <w:t>Control de Versiones</w:t>
       </w:r>
     </w:p>
     <w:p>
       <w:r>
         <w:t>Finaliza el día guardando tu progreso:</w:t>
       </w:r>
-    </w:p>
-    <w:p>
-      <w:r>
+      <w:r>
+        <w:rPr>
+          <w:noProof/>
+        </w:rPr>
         <w:drawing>
           <wp:inline distT="0" distB="0" distL="0" distR="0" wp14:anchorId="53FE49EB" wp14:editId="6A91F0D1">
             <wp:extent cx="5612130" cy="657860"/>
@@ -617,7 +1046,7 @@
                     <pic:cNvPicPr/>
                   </pic:nvPicPr>
                   <pic:blipFill>
-                    <a:blip r:embed="rId8"/>
+                    <a:blip r:embed="rId12"/>
                     <a:stretch>
                       <a:fillRect/>
                     </a:stretch>
@@ -1026,6 +1455,119 @@
       </w:rPr>
     </w:lvl>
   </w:abstractNum>
+  <w:abstractNum w:abstractNumId="3" w15:restartNumberingAfterBreak="0">
+    <w:nsid w:val="35426521"/>
+    <w:multiLevelType w:val="multilevel"/>
+    <w:tmpl w:val="04D48E6C"/>
+    <w:lvl w:ilvl="0">
+      <w:start w:val="1"/>
+      <w:numFmt w:val="decimal"/>
+      <w:lvlText w:val="%1."/>
+      <w:lvlJc w:val="left"/>
+      <w:pPr>
+        <w:tabs>
+          <w:tab w:val="num" w:pos="720"/>
+        </w:tabs>
+        <w:ind w:left="720" w:hanging="360"/>
+      </w:pPr>
+    </w:lvl>
+    <w:lvl w:ilvl="1" w:tentative="1">
+      <w:start w:val="1"/>
+      <w:numFmt w:val="decimal"/>
+      <w:lvlText w:val="%2."/>
+      <w:lvlJc w:val="left"/>
+      <w:pPr>
+        <w:tabs>
+          <w:tab w:val="num" w:pos="1440"/>
+        </w:tabs>
+        <w:ind w:left="1440" w:hanging="360"/>
+      </w:pPr>
+    </w:lvl>
+    <w:lvl w:ilvl="2" w:tentative="1">
+      <w:start w:val="1"/>
+      <w:numFmt w:val="decimal"/>
+      <w:lvlText w:val="%3."/>
+      <w:lvlJc w:val="left"/>
+      <w:pPr>
+        <w:tabs>
+          <w:tab w:val="num" w:pos="2160"/>
+        </w:tabs>
+        <w:ind w:left="2160" w:hanging="360"/>
+      </w:pPr>
+    </w:lvl>
+    <w:lvl w:ilvl="3" w:tentative="1">
+      <w:start w:val="1"/>
+      <w:numFmt w:val="decimal"/>
+      <w:lvlText w:val="%4."/>
+      <w:lvlJc w:val="left"/>
+      <w:pPr>
+        <w:tabs>
+          <w:tab w:val="num" w:pos="2880"/>
+        </w:tabs>
+        <w:ind w:left="2880" w:hanging="360"/>
+      </w:pPr>
+    </w:lvl>
+    <w:lvl w:ilvl="4" w:tentative="1">
+      <w:start w:val="1"/>
+      <w:numFmt w:val="decimal"/>
+      <w:lvlText w:val="%5."/>
+      <w:lvlJc w:val="left"/>
+      <w:pPr>
+        <w:tabs>
+          <w:tab w:val="num" w:pos="3600"/>
+        </w:tabs>
+        <w:ind w:left="3600" w:hanging="360"/>
+      </w:pPr>
+    </w:lvl>
+    <w:lvl w:ilvl="5" w:tentative="1">
+      <w:start w:val="1"/>
+      <w:numFmt w:val="decimal"/>
+      <w:lvlText w:val="%6."/>
+      <w:lvlJc w:val="left"/>
+      <w:pPr>
+        <w:tabs>
+          <w:tab w:val="num" w:pos="4320"/>
+        </w:tabs>
+        <w:ind w:left="4320" w:hanging="360"/>
+      </w:pPr>
+    </w:lvl>
+    <w:lvl w:ilvl="6" w:tentative="1">
+      <w:start w:val="1"/>
+      <w:numFmt w:val="decimal"/>
+      <w:lvlText w:val="%7."/>
+      <w:lvlJc w:val="left"/>
+      <w:pPr>
+        <w:tabs>
+          <w:tab w:val="num" w:pos="5040"/>
+        </w:tabs>
+        <w:ind w:left="5040" w:hanging="360"/>
+      </w:pPr>
+    </w:lvl>
+    <w:lvl w:ilvl="7" w:tentative="1">
+      <w:start w:val="1"/>
+      <w:numFmt w:val="decimal"/>
+      <w:lvlText w:val="%8."/>
+      <w:lvlJc w:val="left"/>
+      <w:pPr>
+        <w:tabs>
+          <w:tab w:val="num" w:pos="5760"/>
+        </w:tabs>
+        <w:ind w:left="5760" w:hanging="360"/>
+      </w:pPr>
+    </w:lvl>
+    <w:lvl w:ilvl="8" w:tentative="1">
+      <w:start w:val="1"/>
+      <w:numFmt w:val="decimal"/>
+      <w:lvlText w:val="%9."/>
+      <w:lvlJc w:val="left"/>
+      <w:pPr>
+        <w:tabs>
+          <w:tab w:val="num" w:pos="6480"/>
+        </w:tabs>
+        <w:ind w:left="6480" w:hanging="360"/>
+      </w:pPr>
+    </w:lvl>
+  </w:abstractNum>
   <w:num w:numId="1" w16cid:durableId="95444979">
     <w:abstractNumId w:val="2"/>
   </w:num>
@@ -1034,6 +1576,9 @@
   </w:num>
   <w:num w:numId="3" w16cid:durableId="1991860154">
     <w:abstractNumId w:val="0"/>
+  </w:num>
+  <w:num w:numId="4" w16cid:durableId="338389523">
+    <w:abstractNumId w:val="3"/>
   </w:num>
 </w:numbering>
 </file>
@@ -1466,7 +2011,6 @@
     <w:next w:val="Normal"/>
     <w:link w:val="Ttulo2Car"/>
     <w:uiPriority w:val="9"/>
-    <w:semiHidden/>
     <w:unhideWhenUsed/>
     <w:qFormat/>
     <w:rsid w:val="00A97ECB"/>
@@ -1641,6 +2185,7 @@
   <w:style w:type="character" w:default="1" w:styleId="Fuentedeprrafopredeter">
     <w:name w:val="Default Paragraph Font"/>
     <w:uiPriority w:val="1"/>
+    <w:semiHidden/>
     <w:unhideWhenUsed/>
   </w:style>
   <w:style w:type="table" w:default="1" w:styleId="Tablanormal">
@@ -1682,7 +2227,6 @@
     <w:basedOn w:val="Fuentedeprrafopredeter"/>
     <w:link w:val="Ttulo2"/>
     <w:uiPriority w:val="9"/>
-    <w:semiHidden/>
     <w:rsid w:val="00A97ECB"/>
     <w:rPr>
       <w:rFonts w:asciiTheme="majorHAnsi" w:eastAsiaTheme="majorEastAsia" w:hAnsiTheme="majorHAnsi" w:cstheme="majorBidi"/>

</xml_diff>